<commit_message>
Add paper push for 2026-05-29
</commit_message>
<xml_diff>
--- a/files/paper-push/daily_paper_push_2026-05-29.docx
+++ b/files/paper-push/daily_paper_push_2026-05-29.docx
@@ -58,7 +58,7 @@
         <w:pStyle w:val="Heading2"/>
       </w:pPr>
       <w:r>
-        <w:t>重点期刊：按影响力和相关性排序</w:t>
+        <w:t>其他相关期刊：按主题相关性补充</w:t>
       </w:r>
     </w:p>
     <w:p>
@@ -70,7 +70,7 @@
           <w:rFonts w:ascii="Microsoft YaHei" w:hAnsi="Microsoft YaHei" w:eastAsia="Microsoft YaHei"/>
           <w:b/>
         </w:rPr>
-        <w:t>1. Responses of phytoplankton functional types to marine heatwaves in China’s marginal seas and adjacent waters</w:t>
+        <w:t>1. New Eocene organic-walled phytoplankton taxa from the Norwegian North Sea, and their regional biostratigraphical application</w:t>
       </w:r>
     </w:p>
     <w:p>
@@ -80,7 +80,7 @@
           <w:color w:val="55697D"/>
           <w:sz w:val="18"/>
         </w:rPr>
-        <w:t>作者：Fangfang Li; Changlin Li; Yuhui Zhou; Weinan Li; Wendong Xian; Wenxiang Ding; Xiangfu Li; Jianxin Wang</w:t>
+        <w:t>作者：Paul Dodsworth; Manuel Vieira; Salih Mahdi</w:t>
       </w:r>
     </w:p>
     <w:p>
@@ -90,7 +90,7 @@
           <w:color w:val="55697D"/>
           <w:sz w:val="18"/>
         </w:rPr>
-        <w:t>期刊：Frontiers in Marine Science</w:t>
+        <w:t>期刊：Palynology</w:t>
       </w:r>
     </w:p>
     <w:p>
@@ -110,7 +110,7 @@
           <w:color w:val="55697D"/>
           <w:sz w:val="18"/>
         </w:rPr>
-        <w:t>DOI：10.3389/fmars.2026.1828780</w:t>
+        <w:t>DOI：10.1080/01916122.2026.2671745</w:t>
       </w:r>
     </w:p>
     <w:p>
@@ -120,7 +120,7 @@
           <w:b/>
           <w:sz w:val="19"/>
         </w:rPr>
-        <w:t>关键词：carbon pump; phytoplankton; marine heatwaves; bio-optics</w:t>
+        <w:t>关键词：phytoplankton; absorption</w:t>
       </w:r>
     </w:p>
     <w:p>
@@ -128,7 +128,7 @@
         <w:rPr>
           <w:rFonts w:ascii="Microsoft YaHei" w:hAnsi="Microsoft YaHei" w:eastAsia="Microsoft YaHei"/>
         </w:rPr>
-        <w:t>这项研究关注海洋热浪对生态结构和碳循环的影响。 数据或方法上围绕沉积物捕获器、原位光学、生物光学参数或光谱观测展开。 研究主要分析变化趋势、事件响应、驱动机制或方法表现，并把观测结果与生态和生物地球化学过程联系起来。 核心结果帮助说明海洋热浪如何通过强度、持续时间或垂向结构影响生态和碳循环过程。 它有助于解释观测现象、比较方法差异，并为后续海洋生物地球化学分析提供线索。</w:t>
+        <w:t>这项研究关注海洋生物光学和海洋光学参数、方法与应用。 数据或方法上围绕沉积物捕获器、原位光学、生物光学参数或光谱观测展开。 研究主要分析变化趋势、事件响应、驱动机制或方法表现，并把观测结果与生态和生物地球化学过程联系起来。 核心结果或实现为该主题提供了新的观测约束、方法基准或过程解释。 它有助于解释观测现象、比较方法差异，并为后续海洋生物地球化学分析提供线索。</w:t>
       </w:r>
     </w:p>
     <w:p>
@@ -138,15 +138,7 @@
           <w:color w:val="0563C1"/>
           <w:sz w:val="18"/>
         </w:rPr>
-        <w:t>链接：https://doi.org/10.3389/fmars.2026.1828780</w:t>
-      </w:r>
-    </w:p>
-    <w:p>
-      <w:pPr>
-        <w:pStyle w:val="Heading2"/>
-      </w:pPr>
-      <w:r>
-        <w:t>其他相关期刊：按主题相关性补充</w:t>
+        <w:t>链接：https://doi.org/10.1080/01916122.2026.2671745</w:t>
       </w:r>
     </w:p>
     <w:p>
@@ -158,7 +150,7 @@
           <w:rFonts w:ascii="Microsoft YaHei" w:hAnsi="Microsoft YaHei" w:eastAsia="Microsoft YaHei"/>
           <w:b/>
         </w:rPr>
-        <w:t>2. Fine-scale observations reveal distinct frontal phytoplankton communities</w:t>
+        <w:t>2. Comparing DNA metabarcoding with light microscopy to identify eukaryotic phytoplankton in the Baltic Sea, Kattegat and Skagerrak</w:t>
       </w:r>
     </w:p>
     <w:p>
@@ -168,7 +160,7 @@
           <w:color w:val="55697D"/>
           <w:sz w:val="18"/>
         </w:rPr>
-        <w:t>作者：Laurina Oms; Andrea Doglioli; Monique Messié; Francesco d’Ovidio; Xavier Capet; Louise Rousselet; Aude Joel; Lloyd Izard; et al.</w:t>
+        <w:t>作者：Anders Torstensson; Sonia Brugel; Anders F. Andersson; Mikael Hedblom; Krzysztof T. Jurdzinski; Bengt Karlson; Meike A. C. Latz; Markus Lindh; et al.</w:t>
       </w:r>
     </w:p>
     <w:p>
@@ -178,7 +170,7 @@
           <w:color w:val="55697D"/>
           <w:sz w:val="18"/>
         </w:rPr>
-        <w:t>期刊：Communications Earth &amp;amp; Environment</w:t>
+        <w:t>期刊：Scientific Reports</w:t>
       </w:r>
     </w:p>
     <w:p>
@@ -198,7 +190,7 @@
           <w:color w:val="55697D"/>
           <w:sz w:val="18"/>
         </w:rPr>
-        <w:t>DOI：10.1038/s43247-026-03350-0</w:t>
+        <w:t>DOI：10.1038/s41598-026-48838-z</w:t>
       </w:r>
     </w:p>
     <w:p>
@@ -208,7 +200,7 @@
           <w:b/>
           <w:sz w:val="19"/>
         </w:rPr>
-        <w:t>关键词：carbon pump; phytoplankton</w:t>
+        <w:t>关键词：phytoplankton; absorption; microbial carbon</w:t>
       </w:r>
     </w:p>
     <w:p>
@@ -216,7 +208,7 @@
         <w:rPr>
           <w:rFonts w:ascii="Microsoft YaHei" w:hAnsi="Microsoft YaHei" w:eastAsia="Microsoft YaHei"/>
         </w:rPr>
-        <w:t>这项研究关注有机碳输出和生物碳泵过程。 研究结合观测、模型或实验结果来刻画海洋生态和生物地球化学过程。 研究主要分析变化趋势、事件响应、驱动机制或方法表现，并把观测结果与生态和生物地球化学过程联系起来。 核心结果或实现为该主题提供了新的观测约束、方法基准或过程解释。 它有助于解释观测现象、比较方法差异，并为后续海洋生物地球化学分析提供线索。</w:t>
+        <w:t>这项研究关注海洋生物光学和海洋光学参数、方法与应用。 数据或方法上围绕沉积物捕获器、原位光学、生物光学参数或光谱观测展开。 研究主要分析变化趋势、事件响应、驱动机制或方法表现，并把观测结果与生态和生物地球化学过程联系起来。 核心结果或实现为该主题提供了新的观测约束、方法基准或过程解释。 它有助于解释观测现象、比较方法差异，并为后续海洋生物地球化学分析提供线索。</w:t>
       </w:r>
     </w:p>
     <w:p>
@@ -226,7 +218,7 @@
           <w:color w:val="0563C1"/>
           <w:sz w:val="18"/>
         </w:rPr>
-        <w:t>链接：https://doi.org/10.1038/s43247-026-03350-0</w:t>
+        <w:t>链接：https://doi.org/10.1038/s41598-026-48838-z</w:t>
       </w:r>
     </w:p>
     <w:sectPr>

</xml_diff>

<commit_message>
Refresh 2026-05-29 paper push
# Conflicts:
#	_data/paper_pushes.yml
#	files/paper-push/daily_paper_push_2026-05-29.docx
#	推送历史_论文索引.csv
</commit_message>
<xml_diff>
--- a/files/paper-push/daily_paper_push_2026-05-29.docx
+++ b/files/paper-push/daily_paper_push_2026-05-29.docx
@@ -42,7 +42,7 @@
         <w:rPr>
           <w:rFonts w:ascii="Microsoft YaHei" w:hAnsi="Microsoft YaHei" w:eastAsia="Microsoft YaHei"/>
         </w:rPr>
-        <w:t>历史去重后今日新增 2 篇。排序规则：Nature 系列、Science 系列、其余重点期刊按影响力和主题相关性排序。</w:t>
+        <w:t>历史去重后今日新增 12 篇。排序规则：Nature 系列、Science 系列、其余重点期刊按影响力和主题相关性排序。</w:t>
       </w:r>
     </w:p>
     <w:p>
@@ -51,6 +51,814 @@
       </w:pPr>
       <w:r>
         <w:t>论文速读</w:t>
+      </w:r>
+    </w:p>
+    <w:p>
+      <w:pPr>
+        <w:pStyle w:val="Heading2"/>
+      </w:pPr>
+      <w:r>
+        <w:t>重点期刊：按影响力和相关性排序</w:t>
+      </w:r>
+    </w:p>
+    <w:p>
+      <w:pPr>
+        <w:pStyle w:val="Heading3"/>
+      </w:pPr>
+      <w:r>
+        <w:rPr>
+          <w:rFonts w:ascii="Microsoft YaHei" w:hAnsi="Microsoft YaHei" w:eastAsia="Microsoft YaHei"/>
+          <w:b/>
+        </w:rPr>
+        <w:t>1. Climate‐Driven Long‐Term Increase in Tidal Wetland Gross Primary Production in the United States</w:t>
+      </w:r>
+    </w:p>
+    <w:p>
+      <w:r>
+        <w:rPr>
+          <w:rFonts w:ascii="Microsoft YaHei" w:hAnsi="Microsoft YaHei" w:eastAsia="Microsoft YaHei"/>
+          <w:color w:val="55697D"/>
+          <w:sz w:val="18"/>
+        </w:rPr>
+        <w:t>作者：Maria Herrmann; Raymond G. Najjar; Rusty A. Feagin; Jose D. Fuentes; Thomas P. Huff; Wenzhe Jiao; Joshua E. Lerner</w:t>
+      </w:r>
+    </w:p>
+    <w:p>
+      <w:r>
+        <w:rPr>
+          <w:rFonts w:ascii="Microsoft YaHei" w:hAnsi="Microsoft YaHei" w:eastAsia="Microsoft YaHei"/>
+          <w:color w:val="55697D"/>
+          <w:sz w:val="18"/>
+        </w:rPr>
+        <w:t>期刊：Global Biogeochemical Cycles</w:t>
+      </w:r>
+    </w:p>
+    <w:p>
+      <w:r>
+        <w:rPr>
+          <w:rFonts w:ascii="Microsoft YaHei" w:hAnsi="Microsoft YaHei" w:eastAsia="Microsoft YaHei"/>
+          <w:color w:val="55697D"/>
+          <w:sz w:val="18"/>
+        </w:rPr>
+        <w:t>发表月份：2026-05</w:t>
+      </w:r>
+    </w:p>
+    <w:p>
+      <w:r>
+        <w:rPr>
+          <w:rFonts w:ascii="Microsoft YaHei" w:hAnsi="Microsoft YaHei" w:eastAsia="Microsoft YaHei"/>
+          <w:color w:val="55697D"/>
+          <w:sz w:val="18"/>
+        </w:rPr>
+        <w:t>DOI：10.1029/2026gb009093</w:t>
+      </w:r>
+    </w:p>
+    <w:p>
+      <w:r>
+        <w:rPr>
+          <w:rFonts w:ascii="Microsoft YaHei" w:hAnsi="Microsoft YaHei" w:eastAsia="Microsoft YaHei"/>
+          <w:b/>
+          <w:sz w:val="19"/>
+        </w:rPr>
+        <w:t>关键词：ocean biogeochemistry</w:t>
+      </w:r>
+    </w:p>
+    <w:p>
+      <w:r>
+        <w:rPr>
+          <w:rFonts w:ascii="Microsoft YaHei" w:hAnsi="Microsoft YaHei" w:eastAsia="Microsoft YaHei"/>
+        </w:rPr>
+        <w:t>这项研究关注海洋生物地球化学过程。 研究结合观测、模型或实验结果来刻画海洋生态和生物地球化学过程。 研究主要分析变化趋势、事件响应、驱动机制或方法表现，并把观测结果与生态和生物地球化学过程联系起来。 核心结果是识别出上升、下降或异常事件信号，并把这些变化放进气候变暖、生产力或碳循环背景下解释。 它有助于解释观测现象、比较方法差异，并为后续海洋生物地球化学分析提供线索。</w:t>
+      </w:r>
+    </w:p>
+    <w:p>
+      <w:r>
+        <w:rPr>
+          <w:rFonts w:ascii="Microsoft YaHei" w:hAnsi="Microsoft YaHei" w:eastAsia="Microsoft YaHei"/>
+          <w:color w:val="0563C1"/>
+          <w:sz w:val="18"/>
+        </w:rPr>
+        <w:t>链接：https://doi.org/10.1029/2026gb009093</w:t>
+      </w:r>
+    </w:p>
+    <w:p>
+      <w:pPr>
+        <w:pStyle w:val="Heading3"/>
+      </w:pPr>
+      <w:r>
+        <w:rPr>
+          <w:rFonts w:ascii="Microsoft YaHei" w:hAnsi="Microsoft YaHei" w:eastAsia="Microsoft YaHei"/>
+          <w:b/>
+        </w:rPr>
+        <w:t>2. Decoding Seasonal C:N:P Ratios and Their Predictors in the Northern Indian Ocean: Implications for Nutrient Stoichiometry in a Changing Climate</w:t>
+      </w:r>
+    </w:p>
+    <w:p>
+      <w:r>
+        <w:rPr>
+          <w:rFonts w:ascii="Microsoft YaHei" w:hAnsi="Microsoft YaHei" w:eastAsia="Microsoft YaHei"/>
+          <w:color w:val="55697D"/>
+          <w:sz w:val="18"/>
+        </w:rPr>
+        <w:t>作者：Abul Qasim; Deepika Sahoo; Arvind Singh</w:t>
+      </w:r>
+    </w:p>
+    <w:p>
+      <w:r>
+        <w:rPr>
+          <w:rFonts w:ascii="Microsoft YaHei" w:hAnsi="Microsoft YaHei" w:eastAsia="Microsoft YaHei"/>
+          <w:color w:val="55697D"/>
+          <w:sz w:val="18"/>
+        </w:rPr>
+        <w:t>期刊：Global Biogeochemical Cycles</w:t>
+      </w:r>
+    </w:p>
+    <w:p>
+      <w:r>
+        <w:rPr>
+          <w:rFonts w:ascii="Microsoft YaHei" w:hAnsi="Microsoft YaHei" w:eastAsia="Microsoft YaHei"/>
+          <w:color w:val="55697D"/>
+          <w:sz w:val="18"/>
+        </w:rPr>
+        <w:t>发表月份：2026-05</w:t>
+      </w:r>
+    </w:p>
+    <w:p>
+      <w:r>
+        <w:rPr>
+          <w:rFonts w:ascii="Microsoft YaHei" w:hAnsi="Microsoft YaHei" w:eastAsia="Microsoft YaHei"/>
+          <w:color w:val="55697D"/>
+          <w:sz w:val="18"/>
+        </w:rPr>
+        <w:t>DOI：10.1029/2025gb008679</w:t>
+      </w:r>
+    </w:p>
+    <w:p>
+      <w:r>
+        <w:rPr>
+          <w:rFonts w:ascii="Microsoft YaHei" w:hAnsi="Microsoft YaHei" w:eastAsia="Microsoft YaHei"/>
+          <w:b/>
+          <w:sz w:val="19"/>
+        </w:rPr>
+        <w:t>关键词：phytoplankton</w:t>
+      </w:r>
+    </w:p>
+    <w:p>
+      <w:r>
+        <w:rPr>
+          <w:rFonts w:ascii="Microsoft YaHei" w:hAnsi="Microsoft YaHei" w:eastAsia="Microsoft YaHei"/>
+        </w:rPr>
+        <w:t>这项研究关注浮游植物群落、生理状态和生产力变化。 研究结合观测、模型或实验结果来刻画海洋生态和生物地球化学过程。 研究主要分析变化趋势、事件响应、驱动机制或方法表现，并把观测结果与生态和生物地球化学过程联系起来。 核心结果或实现为该主题提供了新的观测约束、方法基准或过程解释。 它有助于解释观测现象、比较方法差异，并为后续海洋生物地球化学分析提供线索。</w:t>
+      </w:r>
+    </w:p>
+    <w:p>
+      <w:r>
+        <w:rPr>
+          <w:rFonts w:ascii="Microsoft YaHei" w:hAnsi="Microsoft YaHei" w:eastAsia="Microsoft YaHei"/>
+          <w:color w:val="0563C1"/>
+          <w:sz w:val="18"/>
+        </w:rPr>
+        <w:t>链接：https://doi.org/10.1029/2025gb008679</w:t>
+      </w:r>
+    </w:p>
+    <w:p>
+      <w:pPr>
+        <w:pStyle w:val="Heading3"/>
+      </w:pPr>
+      <w:r>
+        <w:rPr>
+          <w:rFonts w:ascii="Microsoft YaHei" w:hAnsi="Microsoft YaHei" w:eastAsia="Microsoft YaHei"/>
+          <w:b/>
+        </w:rPr>
+        <w:t>3. Analysis of the Spatial Variability of Vertical Carbon Export Efficiency in the Ross Sea Using a Coupled Ocean‐Sea Ice‐Biogeochemical Model</w:t>
+      </w:r>
+    </w:p>
+    <w:p>
+      <w:r>
+        <w:rPr>
+          <w:rFonts w:ascii="Microsoft YaHei" w:hAnsi="Microsoft YaHei" w:eastAsia="Microsoft YaHei"/>
+          <w:color w:val="55697D"/>
+          <w:sz w:val="18"/>
+        </w:rPr>
+        <w:t>作者：Longxing Zhu; Xiaofan Luo; Wei Zhao; Yongli Zhang; Hao Wei</w:t>
+      </w:r>
+    </w:p>
+    <w:p>
+      <w:r>
+        <w:rPr>
+          <w:rFonts w:ascii="Microsoft YaHei" w:hAnsi="Microsoft YaHei" w:eastAsia="Microsoft YaHei"/>
+          <w:color w:val="55697D"/>
+          <w:sz w:val="18"/>
+        </w:rPr>
+        <w:t>期刊：Journal of Geophysical Research: Oceans</w:t>
+      </w:r>
+    </w:p>
+    <w:p>
+      <w:r>
+        <w:rPr>
+          <w:rFonts w:ascii="Microsoft YaHei" w:hAnsi="Microsoft YaHei" w:eastAsia="Microsoft YaHei"/>
+          <w:color w:val="55697D"/>
+          <w:sz w:val="18"/>
+        </w:rPr>
+        <w:t>发表月份：2026-05</w:t>
+      </w:r>
+    </w:p>
+    <w:p>
+      <w:r>
+        <w:rPr>
+          <w:rFonts w:ascii="Microsoft YaHei" w:hAnsi="Microsoft YaHei" w:eastAsia="Microsoft YaHei"/>
+          <w:color w:val="55697D"/>
+          <w:sz w:val="18"/>
+        </w:rPr>
+        <w:t>DOI：10.1029/2025jc022790</w:t>
+      </w:r>
+    </w:p>
+    <w:p>
+      <w:r>
+        <w:rPr>
+          <w:rFonts w:ascii="Microsoft YaHei" w:hAnsi="Microsoft YaHei" w:eastAsia="Microsoft YaHei"/>
+          <w:b/>
+          <w:sz w:val="19"/>
+        </w:rPr>
+        <w:t>关键词：carbon pump; vertical structure</w:t>
+      </w:r>
+    </w:p>
+    <w:p>
+      <w:r>
+        <w:rPr>
+          <w:rFonts w:ascii="Microsoft YaHei" w:hAnsi="Microsoft YaHei" w:eastAsia="Microsoft YaHei"/>
+        </w:rPr>
+        <w:t>这项研究关注有机碳输出和生物碳泵过程。 研究结合观测、模型或实验结果来刻画海洋生态和生物地球化学过程。 研究主要分析变化趋势、事件响应、驱动机制或方法表现，并把观测结果与生态和生物地球化学过程联系起来。 核心结果或实现为该主题提供了新的观测约束、方法基准或过程解释。 它有助于解释观测现象、比较方法差异，并为后续海洋生物地球化学分析提供线索。</w:t>
+      </w:r>
+    </w:p>
+    <w:p>
+      <w:r>
+        <w:rPr>
+          <w:rFonts w:ascii="Microsoft YaHei" w:hAnsi="Microsoft YaHei" w:eastAsia="Microsoft YaHei"/>
+          <w:color w:val="0563C1"/>
+          <w:sz w:val="18"/>
+        </w:rPr>
+        <w:t>链接：https://doi.org/10.1029/2025jc022790</w:t>
+      </w:r>
+    </w:p>
+    <w:p>
+      <w:pPr>
+        <w:pStyle w:val="Heading3"/>
+      </w:pPr>
+      <w:r>
+        <w:rPr>
+          <w:rFonts w:ascii="Microsoft YaHei" w:hAnsi="Microsoft YaHei" w:eastAsia="Microsoft YaHei"/>
+          <w:b/>
+        </w:rPr>
+        <w:t>4. Surface slicks structure microbial and viral neuston in relation to biogeochemical conditions</w:t>
+      </w:r>
+    </w:p>
+    <w:p>
+      <w:r>
+        <w:rPr>
+          <w:rFonts w:ascii="Microsoft YaHei" w:hAnsi="Microsoft YaHei" w:eastAsia="Microsoft YaHei"/>
+          <w:color w:val="55697D"/>
+          <w:sz w:val="18"/>
+        </w:rPr>
+        <w:t>作者：Carolin Peter; Helge‐Ansgar Giebel; Bingli Clark Chai; Tassiana S. G. Serafim; Carola Lehners; Oliver Wurl; Helena Osterholz; Janina Rahlff</w:t>
+      </w:r>
+    </w:p>
+    <w:p>
+      <w:r>
+        <w:rPr>
+          <w:rFonts w:ascii="Microsoft YaHei" w:hAnsi="Microsoft YaHei" w:eastAsia="Microsoft YaHei"/>
+          <w:color w:val="55697D"/>
+          <w:sz w:val="18"/>
+        </w:rPr>
+        <w:t>期刊：Limnology and Oceanography</w:t>
+      </w:r>
+    </w:p>
+    <w:p>
+      <w:r>
+        <w:rPr>
+          <w:rFonts w:ascii="Microsoft YaHei" w:hAnsi="Microsoft YaHei" w:eastAsia="Microsoft YaHei"/>
+          <w:color w:val="55697D"/>
+          <w:sz w:val="18"/>
+        </w:rPr>
+        <w:t>发表月份：2026-05</w:t>
+      </w:r>
+    </w:p>
+    <w:p>
+      <w:r>
+        <w:rPr>
+          <w:rFonts w:ascii="Microsoft YaHei" w:hAnsi="Microsoft YaHei" w:eastAsia="Microsoft YaHei"/>
+          <w:color w:val="55697D"/>
+          <w:sz w:val="18"/>
+        </w:rPr>
+        <w:t>DOI：10.1002/lno.70387</w:t>
+      </w:r>
+    </w:p>
+    <w:p>
+      <w:r>
+        <w:rPr>
+          <w:rFonts w:ascii="Microsoft YaHei" w:hAnsi="Microsoft YaHei" w:eastAsia="Microsoft YaHei"/>
+          <w:b/>
+          <w:sz w:val="19"/>
+        </w:rPr>
+        <w:t>关键词：phytoplankton; microbial carbon</w:t>
+      </w:r>
+    </w:p>
+    <w:p>
+      <w:r>
+        <w:rPr>
+          <w:rFonts w:ascii="Microsoft YaHei" w:hAnsi="Microsoft YaHei" w:eastAsia="Microsoft YaHei"/>
+        </w:rPr>
+        <w:t>这项研究关注浮游植物群落、生理状态和生产力变化。 研究结合观测、模型或实验结果来刻画海洋生态和生物地球化学过程。 研究主要分析变化趋势、事件响应、驱动机制或方法表现，并把观测结果与生态和生物地球化学过程联系起来。 核心结果或实现为该主题提供了新的观测约束、方法基准或过程解释。 它有助于解释观测现象、比较方法差异，并为后续海洋生物地球化学分析提供线索。</w:t>
+      </w:r>
+    </w:p>
+    <w:p>
+      <w:r>
+        <w:rPr>
+          <w:rFonts w:ascii="Microsoft YaHei" w:hAnsi="Microsoft YaHei" w:eastAsia="Microsoft YaHei"/>
+          <w:color w:val="0563C1"/>
+          <w:sz w:val="18"/>
+        </w:rPr>
+        <w:t>链接：https://doi.org/10.1002/lno.70387</w:t>
+      </w:r>
+    </w:p>
+    <w:p>
+      <w:pPr>
+        <w:pStyle w:val="Heading3"/>
+      </w:pPr>
+      <w:r>
+        <w:rPr>
+          <w:rFonts w:ascii="Microsoft YaHei" w:hAnsi="Microsoft YaHei" w:eastAsia="Microsoft YaHei"/>
+          <w:b/>
+        </w:rPr>
+        <w:t>5. Complexity in biogeochemical models: consequences for the biological carbon pump</w:t>
+      </w:r>
+    </w:p>
+    <w:p>
+      <w:r>
+        <w:rPr>
+          <w:rFonts w:ascii="Microsoft YaHei" w:hAnsi="Microsoft YaHei" w:eastAsia="Microsoft YaHei"/>
+          <w:color w:val="55697D"/>
+          <w:sz w:val="18"/>
+        </w:rPr>
+        <w:t>作者：Jonathan Rogerson; Alessandro Tagliabue; Agathe Nguyen; Marcello Vichi; Lewis Wrightson; Prima Anugerahanti; Olivier Aumont; Marion Gehlen</w:t>
+      </w:r>
+    </w:p>
+    <w:p>
+      <w:r>
+        <w:rPr>
+          <w:rFonts w:ascii="Microsoft YaHei" w:hAnsi="Microsoft YaHei" w:eastAsia="Microsoft YaHei"/>
+          <w:color w:val="55697D"/>
+          <w:sz w:val="18"/>
+        </w:rPr>
+        <w:t>期刊：Biogeosciences</w:t>
+      </w:r>
+    </w:p>
+    <w:p>
+      <w:r>
+        <w:rPr>
+          <w:rFonts w:ascii="Microsoft YaHei" w:hAnsi="Microsoft YaHei" w:eastAsia="Microsoft YaHei"/>
+          <w:color w:val="55697D"/>
+          <w:sz w:val="18"/>
+        </w:rPr>
+        <w:t>发表月份：2026-05</w:t>
+      </w:r>
+    </w:p>
+    <w:p>
+      <w:r>
+        <w:rPr>
+          <w:rFonts w:ascii="Microsoft YaHei" w:hAnsi="Microsoft YaHei" w:eastAsia="Microsoft YaHei"/>
+          <w:color w:val="55697D"/>
+          <w:sz w:val="18"/>
+        </w:rPr>
+        <w:t>DOI：10.5194/bg-23-3179-2026</w:t>
+      </w:r>
+    </w:p>
+    <w:p>
+      <w:r>
+        <w:rPr>
+          <w:rFonts w:ascii="Microsoft YaHei" w:hAnsi="Microsoft YaHei" w:eastAsia="Microsoft YaHei"/>
+          <w:b/>
+          <w:sz w:val="19"/>
+        </w:rPr>
+        <w:t>关键词：carbon pump; phytoplankton</w:t>
+      </w:r>
+    </w:p>
+    <w:p>
+      <w:r>
+        <w:rPr>
+          <w:rFonts w:ascii="Microsoft YaHei" w:hAnsi="Microsoft YaHei" w:eastAsia="Microsoft YaHei"/>
+        </w:rPr>
+        <w:t>这项研究关注有机碳输出和生物碳泵过程。 研究结合观测、模型或实验结果来刻画海洋生态和生物地球化学过程。 研究主要分析变化趋势、事件响应、驱动机制或方法表现，并把观测结果与生态和生物地球化学过程联系起来。 核心结果或实现为该主题提供了新的观测约束、方法基准或过程解释。 它有助于解释观测现象、比较方法差异，并为后续海洋生物地球化学分析提供线索。</w:t>
+      </w:r>
+    </w:p>
+    <w:p>
+      <w:r>
+        <w:rPr>
+          <w:rFonts w:ascii="Microsoft YaHei" w:hAnsi="Microsoft YaHei" w:eastAsia="Microsoft YaHei"/>
+          <w:color w:val="0563C1"/>
+          <w:sz w:val="18"/>
+        </w:rPr>
+        <w:t>链接：https://doi.org/10.5194/bg-23-3179-2026</w:t>
+      </w:r>
+    </w:p>
+    <w:p>
+      <w:pPr>
+        <w:pStyle w:val="Heading3"/>
+      </w:pPr>
+      <w:r>
+        <w:rPr>
+          <w:rFonts w:ascii="Microsoft YaHei" w:hAnsi="Microsoft YaHei" w:eastAsia="Microsoft YaHei"/>
+          <w:b/>
+        </w:rPr>
+        <w:t>6. Dissolved oxygen budget in the Levantine Sea: a coupled physical-biogeochemical modelling approach</w:t>
+      </w:r>
+    </w:p>
+    <w:p>
+      <w:r>
+        <w:rPr>
+          <w:rFonts w:ascii="Microsoft YaHei" w:hAnsi="Microsoft YaHei" w:eastAsia="Microsoft YaHei"/>
+          <w:color w:val="55697D"/>
+          <w:sz w:val="18"/>
+        </w:rPr>
+        <w:t>作者：Joelle Habib; Caroline Ulses; Claude Estournel; Milad Fakhri; Patrick Marsaleix; Thierry Moutin; Dominique Lefevre; Mireille Pujo-Pay; et al.</w:t>
+      </w:r>
+    </w:p>
+    <w:p>
+      <w:r>
+        <w:rPr>
+          <w:rFonts w:ascii="Microsoft YaHei" w:hAnsi="Microsoft YaHei" w:eastAsia="Microsoft YaHei"/>
+          <w:color w:val="55697D"/>
+          <w:sz w:val="18"/>
+        </w:rPr>
+        <w:t>期刊：Biogeosciences</w:t>
+      </w:r>
+    </w:p>
+    <w:p>
+      <w:r>
+        <w:rPr>
+          <w:rFonts w:ascii="Microsoft YaHei" w:hAnsi="Microsoft YaHei" w:eastAsia="Microsoft YaHei"/>
+          <w:color w:val="55697D"/>
+          <w:sz w:val="18"/>
+        </w:rPr>
+        <w:t>发表月份：2026-05</w:t>
+      </w:r>
+    </w:p>
+    <w:p>
+      <w:r>
+        <w:rPr>
+          <w:rFonts w:ascii="Microsoft YaHei" w:hAnsi="Microsoft YaHei" w:eastAsia="Microsoft YaHei"/>
+          <w:color w:val="55697D"/>
+          <w:sz w:val="18"/>
+        </w:rPr>
+        <w:t>DOI：10.5194/bg-23-2939-2026</w:t>
+      </w:r>
+    </w:p>
+    <w:p>
+      <w:r>
+        <w:rPr>
+          <w:rFonts w:ascii="Microsoft YaHei" w:hAnsi="Microsoft YaHei" w:eastAsia="Microsoft YaHei"/>
+          <w:b/>
+          <w:sz w:val="19"/>
+        </w:rPr>
+        <w:t>关键词：vertical structure</w:t>
+      </w:r>
+    </w:p>
+    <w:p>
+      <w:r>
+        <w:rPr>
+          <w:rFonts w:ascii="Microsoft YaHei" w:hAnsi="Microsoft YaHei" w:eastAsia="Microsoft YaHei"/>
+        </w:rPr>
+        <w:t>这项研究关注海洋生物地球化学过程。 研究结合观测、模型或实验结果来刻画海洋生态和生物地球化学过程。 研究主要分析变化趋势、事件响应、驱动机制或方法表现，并把观测结果与生态和生物地球化学过程联系起来。 核心实现是提出可复用的框架、流程或数据产品，使类似观测、反演、验证或趋势分析可以更系统地开展。 它有助于解释观测现象、比较方法差异，并为后续海洋生物地球化学分析提供线索。</w:t>
+      </w:r>
+    </w:p>
+    <w:p>
+      <w:r>
+        <w:rPr>
+          <w:rFonts w:ascii="Microsoft YaHei" w:hAnsi="Microsoft YaHei" w:eastAsia="Microsoft YaHei"/>
+          <w:color w:val="0563C1"/>
+          <w:sz w:val="18"/>
+        </w:rPr>
+        <w:t>链接：https://doi.org/10.5194/bg-23-2939-2026</w:t>
+      </w:r>
+    </w:p>
+    <w:p>
+      <w:pPr>
+        <w:pStyle w:val="Heading3"/>
+      </w:pPr>
+      <w:r>
+        <w:rPr>
+          <w:rFonts w:ascii="Microsoft YaHei" w:hAnsi="Microsoft YaHei" w:eastAsia="Microsoft YaHei"/>
+          <w:b/>
+        </w:rPr>
+        <w:t>7. Understanding Regional p CO 2 Model Biases and Uncertainties in the Biogeochemical Southern Ocean State Estimate (B‐SOSE)</w:t>
+      </w:r>
+    </w:p>
+    <w:p>
+      <w:r>
+        <w:rPr>
+          <w:rFonts w:ascii="Microsoft YaHei" w:hAnsi="Microsoft YaHei" w:eastAsia="Microsoft YaHei"/>
+          <w:color w:val="55697D"/>
+          <w:sz w:val="18"/>
+        </w:rPr>
+        <w:t>作者：Angela M. Kuhn; Matthew R. Mazloff; Sarah T. Gille; Ariane Verdy</w:t>
+      </w:r>
+    </w:p>
+    <w:p>
+      <w:r>
+        <w:rPr>
+          <w:rFonts w:ascii="Microsoft YaHei" w:hAnsi="Microsoft YaHei" w:eastAsia="Microsoft YaHei"/>
+          <w:color w:val="55697D"/>
+          <w:sz w:val="18"/>
+        </w:rPr>
+        <w:t>期刊：Biogeosciences</w:t>
+      </w:r>
+    </w:p>
+    <w:p>
+      <w:r>
+        <w:rPr>
+          <w:rFonts w:ascii="Microsoft YaHei" w:hAnsi="Microsoft YaHei" w:eastAsia="Microsoft YaHei"/>
+          <w:color w:val="55697D"/>
+          <w:sz w:val="18"/>
+        </w:rPr>
+        <w:t>发表月份：2026-05</w:t>
+      </w:r>
+    </w:p>
+    <w:p>
+      <w:r>
+        <w:rPr>
+          <w:rFonts w:ascii="Microsoft YaHei" w:hAnsi="Microsoft YaHei" w:eastAsia="Microsoft YaHei"/>
+          <w:color w:val="55697D"/>
+          <w:sz w:val="18"/>
+        </w:rPr>
+        <w:t>DOI：10.1029/2025jg009491</w:t>
+      </w:r>
+    </w:p>
+    <w:p>
+      <w:r>
+        <w:rPr>
+          <w:rFonts w:ascii="Microsoft YaHei" w:hAnsi="Microsoft YaHei" w:eastAsia="Microsoft YaHei"/>
+          <w:b/>
+          <w:sz w:val="19"/>
+        </w:rPr>
+        <w:t>关键词：phytoplankton</w:t>
+      </w:r>
+    </w:p>
+    <w:p>
+      <w:r>
+        <w:rPr>
+          <w:rFonts w:ascii="Microsoft YaHei" w:hAnsi="Microsoft YaHei" w:eastAsia="Microsoft YaHei"/>
+        </w:rPr>
+        <w:t>这项研究关注浮游植物群落、生理状态和生产力变化。 研究结合观测、模型或实验结果来刻画海洋生态和生物地球化学过程。 研究主要分析变化趋势、事件响应、驱动机制或方法表现，并把观测结果与生态和生物地球化学过程联系起来。 核心结果或实现为该主题提供了新的观测约束、方法基准或过程解释。 它有助于解释观测现象、比较方法差异，并为后续海洋生物地球化学分析提供线索。</w:t>
+      </w:r>
+    </w:p>
+    <w:p>
+      <w:r>
+        <w:rPr>
+          <w:rFonts w:ascii="Microsoft YaHei" w:hAnsi="Microsoft YaHei" w:eastAsia="Microsoft YaHei"/>
+          <w:color w:val="0563C1"/>
+          <w:sz w:val="18"/>
+        </w:rPr>
+        <w:t>链接：https://doi.org/10.1029/2025jg009491</w:t>
+      </w:r>
+    </w:p>
+    <w:p>
+      <w:pPr>
+        <w:pStyle w:val="Heading3"/>
+      </w:pPr>
+      <w:r>
+        <w:rPr>
+          <w:rFonts w:ascii="Microsoft YaHei" w:hAnsi="Microsoft YaHei" w:eastAsia="Microsoft YaHei"/>
+          <w:b/>
+        </w:rPr>
+        <w:t>8. Responses of phytoplankton functional types to marine heatwaves in China’s marginal seas and adjacent waters</w:t>
+      </w:r>
+    </w:p>
+    <w:p>
+      <w:r>
+        <w:rPr>
+          <w:rFonts w:ascii="Microsoft YaHei" w:hAnsi="Microsoft YaHei" w:eastAsia="Microsoft YaHei"/>
+          <w:color w:val="55697D"/>
+          <w:sz w:val="18"/>
+        </w:rPr>
+        <w:t>作者：Fangfang Li; Changlin Li; Yuhui Zhou; Weinan Li; Wendong Xian; Wenxiang Ding; Xiangfu Li; Jianxin Wang</w:t>
+      </w:r>
+    </w:p>
+    <w:p>
+      <w:r>
+        <w:rPr>
+          <w:rFonts w:ascii="Microsoft YaHei" w:hAnsi="Microsoft YaHei" w:eastAsia="Microsoft YaHei"/>
+          <w:color w:val="55697D"/>
+          <w:sz w:val="18"/>
+        </w:rPr>
+        <w:t>期刊：Frontiers in Marine Science</w:t>
+      </w:r>
+    </w:p>
+    <w:p>
+      <w:r>
+        <w:rPr>
+          <w:rFonts w:ascii="Microsoft YaHei" w:hAnsi="Microsoft YaHei" w:eastAsia="Microsoft YaHei"/>
+          <w:color w:val="55697D"/>
+          <w:sz w:val="18"/>
+        </w:rPr>
+        <w:t>发表月份：2026-05</w:t>
+      </w:r>
+    </w:p>
+    <w:p>
+      <w:r>
+        <w:rPr>
+          <w:rFonts w:ascii="Microsoft YaHei" w:hAnsi="Microsoft YaHei" w:eastAsia="Microsoft YaHei"/>
+          <w:color w:val="55697D"/>
+          <w:sz w:val="18"/>
+        </w:rPr>
+        <w:t>DOI：10.3389/fmars.2026.1828780</w:t>
+      </w:r>
+    </w:p>
+    <w:p>
+      <w:r>
+        <w:rPr>
+          <w:rFonts w:ascii="Microsoft YaHei" w:hAnsi="Microsoft YaHei" w:eastAsia="Microsoft YaHei"/>
+          <w:b/>
+          <w:sz w:val="19"/>
+        </w:rPr>
+        <w:t>关键词：carbon pump; phytoplankton; marine heatwaves; bio-optics</w:t>
+      </w:r>
+    </w:p>
+    <w:p>
+      <w:r>
+        <w:rPr>
+          <w:rFonts w:ascii="Microsoft YaHei" w:hAnsi="Microsoft YaHei" w:eastAsia="Microsoft YaHei"/>
+        </w:rPr>
+        <w:t>这项研究关注海洋热浪对生态结构和碳循环的影响。 数据或方法上围绕沉积物捕获器、原位光学、生物光学参数或光谱观测展开。 研究主要分析变化趋势、事件响应、驱动机制或方法表现，并把观测结果与生态和生物地球化学过程联系起来。 核心结果帮助说明海洋热浪如何通过强度、持续时间或垂向结构影响生态和碳循环过程。 它有助于解释观测现象、比较方法差异，并为后续海洋生物地球化学分析提供线索。</w:t>
+      </w:r>
+    </w:p>
+    <w:p>
+      <w:r>
+        <w:rPr>
+          <w:rFonts w:ascii="Microsoft YaHei" w:hAnsi="Microsoft YaHei" w:eastAsia="Microsoft YaHei"/>
+          <w:color w:val="0563C1"/>
+          <w:sz w:val="18"/>
+        </w:rPr>
+        <w:t>链接：https://doi.org/10.3389/fmars.2026.1828780</w:t>
+      </w:r>
+    </w:p>
+    <w:p>
+      <w:pPr>
+        <w:pStyle w:val="Heading3"/>
+      </w:pPr>
+      <w:r>
+        <w:rPr>
+          <w:rFonts w:ascii="Microsoft YaHei" w:hAnsi="Microsoft YaHei" w:eastAsia="Microsoft YaHei"/>
+          <w:b/>
+        </w:rPr>
+        <w:t>9. Quantitative Elemental Masses of a Single Marine Phytoplankton Evaluated with Soft X-ray Spectro-ptychography</w:t>
+      </w:r>
+    </w:p>
+    <w:p>
+      <w:r>
+        <w:rPr>
+          <w:rFonts w:ascii="Microsoft YaHei" w:hAnsi="Microsoft YaHei" w:eastAsia="Microsoft YaHei"/>
+          <w:color w:val="55697D"/>
+          <w:sz w:val="18"/>
+        </w:rPr>
+        <w:t>作者：Jordan O'Neal; Satoshi Matsuyama; Kai Sakurai; Kyota Yoshinaga; Yu Nakata; Chiho Funaki; Yoko Takeo; Takenori Shimamura; et al.</w:t>
+      </w:r>
+    </w:p>
+    <w:p>
+      <w:r>
+        <w:rPr>
+          <w:rFonts w:ascii="Microsoft YaHei" w:hAnsi="Microsoft YaHei" w:eastAsia="Microsoft YaHei"/>
+          <w:color w:val="55697D"/>
+          <w:sz w:val="18"/>
+        </w:rPr>
+        <w:t>期刊：Optics Express</w:t>
+      </w:r>
+    </w:p>
+    <w:p>
+      <w:r>
+        <w:rPr>
+          <w:rFonts w:ascii="Microsoft YaHei" w:hAnsi="Microsoft YaHei" w:eastAsia="Microsoft YaHei"/>
+          <w:color w:val="55697D"/>
+          <w:sz w:val="18"/>
+        </w:rPr>
+        <w:t>发表月份：2026-05</w:t>
+      </w:r>
+    </w:p>
+    <w:p>
+      <w:r>
+        <w:rPr>
+          <w:rFonts w:ascii="Microsoft YaHei" w:hAnsi="Microsoft YaHei" w:eastAsia="Microsoft YaHei"/>
+          <w:color w:val="55697D"/>
+          <w:sz w:val="18"/>
+        </w:rPr>
+        <w:t>DOI：10.1364/oe.589585</w:t>
+      </w:r>
+    </w:p>
+    <w:p>
+      <w:r>
+        <w:rPr>
+          <w:rFonts w:ascii="Microsoft YaHei" w:hAnsi="Microsoft YaHei" w:eastAsia="Microsoft YaHei"/>
+          <w:b/>
+          <w:sz w:val="19"/>
+        </w:rPr>
+        <w:t>关键词：phytoplankton</w:t>
+      </w:r>
+    </w:p>
+    <w:p>
+      <w:r>
+        <w:rPr>
+          <w:rFonts w:ascii="Microsoft YaHei" w:hAnsi="Microsoft YaHei" w:eastAsia="Microsoft YaHei"/>
+        </w:rPr>
+        <w:t>这项研究关注浮游植物群落、生理状态和生产力变化。 研究结合观测、模型或实验结果来刻画海洋生态和生物地球化学过程。 研究主要分析变化趋势、事件响应、驱动机制或方法表现，并把观测结果与生态和生物地球化学过程联系起来。 核心结果或实现为该主题提供了新的观测约束、方法基准或过程解释。 它有助于解释观测现象、比较方法差异，并为后续海洋生物地球化学分析提供线索。</w:t>
+      </w:r>
+    </w:p>
+    <w:p>
+      <w:r>
+        <w:rPr>
+          <w:rFonts w:ascii="Microsoft YaHei" w:hAnsi="Microsoft YaHei" w:eastAsia="Microsoft YaHei"/>
+          <w:color w:val="0563C1"/>
+          <w:sz w:val="18"/>
+        </w:rPr>
+        <w:t>链接：https://doi.org/10.1364/oe.589585</w:t>
+      </w:r>
+    </w:p>
+    <w:p>
+      <w:pPr>
+        <w:pStyle w:val="Heading3"/>
+      </w:pPr>
+      <w:r>
+        <w:rPr>
+          <w:rFonts w:ascii="Microsoft YaHei" w:hAnsi="Microsoft YaHei" w:eastAsia="Microsoft YaHei"/>
+          <w:b/>
+        </w:rPr>
+        <w:t>10. An Absorption-Based Bio-Optical Framework for Phytoplankton Size Class Retrieval in the Arabian Sea</w:t>
+      </w:r>
+    </w:p>
+    <w:p>
+      <w:r>
+        <w:rPr>
+          <w:rFonts w:ascii="Microsoft YaHei" w:hAnsi="Microsoft YaHei" w:eastAsia="Microsoft YaHei"/>
+          <w:color w:val="55697D"/>
+          <w:sz w:val="18"/>
+        </w:rPr>
+        <w:t>作者：R. Chandrasekhar Naik; Aneesh A. Lotliker; Sudarsana Rao Pandi; Joaquim I. Goes; Rupam Kalita; Sanjiba Kumar Baliarsingh; Alakes Samanta</w:t>
+      </w:r>
+    </w:p>
+    <w:p>
+      <w:r>
+        <w:rPr>
+          <w:rFonts w:ascii="Microsoft YaHei" w:hAnsi="Microsoft YaHei" w:eastAsia="Microsoft YaHei"/>
+          <w:color w:val="55697D"/>
+          <w:sz w:val="18"/>
+        </w:rPr>
+        <w:t>期刊：Remote Sensing</w:t>
+      </w:r>
+    </w:p>
+    <w:p>
+      <w:r>
+        <w:rPr>
+          <w:rFonts w:ascii="Microsoft YaHei" w:hAnsi="Microsoft YaHei" w:eastAsia="Microsoft YaHei"/>
+          <w:color w:val="55697D"/>
+          <w:sz w:val="18"/>
+        </w:rPr>
+        <w:t>发表月份：2026-05</w:t>
+      </w:r>
+    </w:p>
+    <w:p>
+      <w:r>
+        <w:rPr>
+          <w:rFonts w:ascii="Microsoft YaHei" w:hAnsi="Microsoft YaHei" w:eastAsia="Microsoft YaHei"/>
+          <w:color w:val="55697D"/>
+          <w:sz w:val="18"/>
+        </w:rPr>
+        <w:t>DOI：10.3390/rs18101451</w:t>
+      </w:r>
+    </w:p>
+    <w:p>
+      <w:r>
+        <w:rPr>
+          <w:rFonts w:ascii="Microsoft YaHei" w:hAnsi="Microsoft YaHei" w:eastAsia="Microsoft YaHei"/>
+          <w:b/>
+          <w:sz w:val="19"/>
+        </w:rPr>
+        <w:t>关键词：carbon pump; phytoplankton; absorption; bio-optics</w:t>
+      </w:r>
+    </w:p>
+    <w:p>
+      <w:r>
+        <w:rPr>
+          <w:rFonts w:ascii="Microsoft YaHei" w:hAnsi="Microsoft YaHei" w:eastAsia="Microsoft YaHei"/>
+        </w:rPr>
+        <w:t>这项研究关注海洋生物光学和海洋光学参数、方法与应用。 数据或方法上围绕沉积物捕获器、原位光学、生物光学参数或光谱观测展开。 研究重点是建立或评估反演/估计框架，把观测信号转化为浮游植物、叶绿素、吸收或碳通量等变量。 核心实现是提出可复用的框架、流程或数据产品，使类似观测、反演、验证或趋势分析可以更系统地开展。 它有助于解释观测现象、比较方法差异，并为后续海洋生物地球化学分析提供线索。</w:t>
+      </w:r>
+    </w:p>
+    <w:p>
+      <w:r>
+        <w:rPr>
+          <w:rFonts w:ascii="Microsoft YaHei" w:hAnsi="Microsoft YaHei" w:eastAsia="Microsoft YaHei"/>
+          <w:color w:val="0563C1"/>
+          <w:sz w:val="18"/>
+        </w:rPr>
+        <w:t>链接：https://doi.org/10.3390/rs18101451</w:t>
       </w:r>
     </w:p>
     <w:p>
@@ -70,7 +878,7 @@
           <w:rFonts w:ascii="Microsoft YaHei" w:hAnsi="Microsoft YaHei" w:eastAsia="Microsoft YaHei"/>
           <w:b/>
         </w:rPr>
-        <w:t>1. New Eocene organic-walled phytoplankton taxa from the Norwegian North Sea, and their regional biostratigraphical application</w:t>
+        <w:t>11. Fine-scale observations reveal distinct frontal phytoplankton communities</w:t>
       </w:r>
     </w:p>
     <w:p>
@@ -80,7 +888,7 @@
           <w:color w:val="55697D"/>
           <w:sz w:val="18"/>
         </w:rPr>
-        <w:t>作者：Paul Dodsworth; Manuel Vieira; Salih Mahdi</w:t>
+        <w:t>作者：Laurina Oms; Andrea Doglioli; Monique Messié; Francesco d’Ovidio; Xavier Capet; Louise Rousselet; Aude Joel; Lloyd Izard; et al.</w:t>
       </w:r>
     </w:p>
     <w:p>
@@ -90,7 +898,7 @@
           <w:color w:val="55697D"/>
           <w:sz w:val="18"/>
         </w:rPr>
-        <w:t>期刊：Palynology</w:t>
+        <w:t>期刊：Communications Earth &amp;amp; Environment</w:t>
       </w:r>
     </w:p>
     <w:p>
@@ -110,7 +918,7 @@
           <w:color w:val="55697D"/>
           <w:sz w:val="18"/>
         </w:rPr>
-        <w:t>DOI：10.1080/01916122.2026.2671745</w:t>
+        <w:t>DOI：10.1038/s43247-026-03350-0</w:t>
       </w:r>
     </w:p>
     <w:p>
@@ -120,7 +928,7 @@
           <w:b/>
           <w:sz w:val="19"/>
         </w:rPr>
-        <w:t>关键词：phytoplankton; absorption</w:t>
+        <w:t>关键词：carbon pump; phytoplankton</w:t>
       </w:r>
     </w:p>
     <w:p>
@@ -128,7 +936,7 @@
         <w:rPr>
           <w:rFonts w:ascii="Microsoft YaHei" w:hAnsi="Microsoft YaHei" w:eastAsia="Microsoft YaHei"/>
         </w:rPr>
-        <w:t>这项研究关注海洋生物光学和海洋光学参数、方法与应用。 数据或方法上围绕沉积物捕获器、原位光学、生物光学参数或光谱观测展开。 研究主要分析变化趋势、事件响应、驱动机制或方法表现，并把观测结果与生态和生物地球化学过程联系起来。 核心结果或实现为该主题提供了新的观测约束、方法基准或过程解释。 它有助于解释观测现象、比较方法差异，并为后续海洋生物地球化学分析提供线索。</w:t>
+        <w:t>这项研究关注有机碳输出和生物碳泵过程。 研究结合观测、模型或实验结果来刻画海洋生态和生物地球化学过程。 研究主要分析变化趋势、事件响应、驱动机制或方法表现，并把观测结果与生态和生物地球化学过程联系起来。 核心结果或实现为该主题提供了新的观测约束、方法基准或过程解释。 它有助于解释观测现象、比较方法差异，并为后续海洋生物地球化学分析提供线索。</w:t>
       </w:r>
     </w:p>
     <w:p>
@@ -138,7 +946,7 @@
           <w:color w:val="0563C1"/>
           <w:sz w:val="18"/>
         </w:rPr>
-        <w:t>链接：https://doi.org/10.1080/01916122.2026.2671745</w:t>
+        <w:t>链接：https://doi.org/10.1038/s43247-026-03350-0</w:t>
       </w:r>
     </w:p>
     <w:p>
@@ -150,7 +958,7 @@
           <w:rFonts w:ascii="Microsoft YaHei" w:hAnsi="Microsoft YaHei" w:eastAsia="Microsoft YaHei"/>
           <w:b/>
         </w:rPr>
-        <w:t>2. Comparing DNA metabarcoding with light microscopy to identify eukaryotic phytoplankton in the Baltic Sea, Kattegat and Skagerrak</w:t>
+        <w:t>12. Microbial Mediation of Biogeochemical Cycles in Seagrass Ecosystems: Functions, Stressors, and Technological Innovations</w:t>
       </w:r>
     </w:p>
     <w:p>
@@ -160,7 +968,7 @@
           <w:color w:val="55697D"/>
           <w:sz w:val="18"/>
         </w:rPr>
-        <w:t>作者：Anders Torstensson; Sonia Brugel; Anders F. Andersson; Mikael Hedblom; Krzysztof T. Jurdzinski; Bengt Karlson; Meike A. C. Latz; Markus Lindh; et al.</w:t>
+        <w:t>作者：Kasturi Taneti; Elavumkudi Paulose Nobi; Sigamani Sivaraj; Jayaraj Rajkumar; Elangovan Dilipan</w:t>
       </w:r>
     </w:p>
     <w:p>
@@ -170,7 +978,7 @@
           <w:color w:val="55697D"/>
           <w:sz w:val="18"/>
         </w:rPr>
-        <w:t>期刊：Scientific Reports</w:t>
+        <w:t>期刊：Marine Ecology</w:t>
       </w:r>
     </w:p>
     <w:p>
@@ -190,7 +998,7 @@
           <w:color w:val="55697D"/>
           <w:sz w:val="18"/>
         </w:rPr>
-        <w:t>DOI：10.1038/s41598-026-48838-z</w:t>
+        <w:t>DOI：10.1111/maec.70100</w:t>
       </w:r>
     </w:p>
     <w:p>
@@ -200,7 +1008,7 @@
           <w:b/>
           <w:sz w:val="19"/>
         </w:rPr>
-        <w:t>关键词：phytoplankton; absorption; microbial carbon</w:t>
+        <w:t>关键词：ocean colour; microbial carbon</w:t>
       </w:r>
     </w:p>
     <w:p>
@@ -208,7 +1016,7 @@
         <w:rPr>
           <w:rFonts w:ascii="Microsoft YaHei" w:hAnsi="Microsoft YaHei" w:eastAsia="Microsoft YaHei"/>
         </w:rPr>
-        <w:t>这项研究关注海洋生物光学和海洋光学参数、方法与应用。 数据或方法上围绕沉积物捕获器、原位光学、生物光学参数或光谱观测展开。 研究主要分析变化趋势、事件响应、驱动机制或方法表现，并把观测结果与生态和生物地球化学过程联系起来。 核心结果或实现为该主题提供了新的观测约束、方法基准或过程解释。 它有助于解释观测现象、比较方法差异，并为后续海洋生物地球化学分析提供线索。</w:t>
+        <w:t>这项研究关注海色遥感中的浮游植物和光学信号变化。 数据上主要面向卫星海色、叶绿素或遥感反射率记录，并在需要时结合原位或剖面观测进行约束。 研究主要分析变化趋势、事件响应、驱动机制或方法表现，并把观测结果与生态和生物地球化学过程联系起来。 核心结果或实现为该主题提供了新的观测约束、方法基准或过程解释。 它有助于解释观测现象、比较方法差异，并为后续海洋生物地球化学分析提供线索。</w:t>
       </w:r>
     </w:p>
     <w:p>
@@ -218,7 +1026,7 @@
           <w:color w:val="0563C1"/>
           <w:sz w:val="18"/>
         </w:rPr>
-        <w:t>链接：https://doi.org/10.1038/s41598-026-48838-z</w:t>
+        <w:t>链接：https://doi.org/10.1111/maec.70100</w:t>
       </w:r>
     </w:p>
     <w:sectPr>

</xml_diff>